<commit_message>
WIP: v2 schema, person match widget, application-person-link endpoint
</commit_message>
<xml_diff>
--- a/docs/SRS-SPPO_User_Manual_v1.3.docx
+++ b/docs/SRS-SPPO_User_Manual_v1.3.docx
@@ -6,61 +6,15 @@
       <w:pPr>
         <w:pStyle w:val="Subtitle"/>
         <w:spacing w:after="0" w:line="360" w:lineRule="auto"/>
-        <w:jc w:val="both"/>
-        <w:rPr>
-          <w:rFonts w:ascii="Courier New" w:hAnsi="Courier New" w:cs="Courier New"/>
-          <w:i w:val="0"/>
-          <w:iCs/>
-          <w:color w:val="auto"/>
-          <w:sz w:val="24"/>
-          <w:szCs w:val="24"/>
-        </w:rPr>
-      </w:pPr>
-      <w:r>
-        <w:rPr>
-          <w:rFonts w:ascii="Courier New" w:hAnsi="Courier New" w:cs="Courier New"/>
-          <w:i w:val="0"/>
-          <w:iCs/>
-          <w:color w:val="auto"/>
-          <w:sz w:val="24"/>
-          <w:szCs w:val="24"/>
-        </w:rPr>
-        <w:t>USER MANUAL</w:t>
-      </w:r>
-    </w:p>
-    <w:p>
-      <w:pPr>
-        <w:pStyle w:val="CoverAudience"/>
-        <w:spacing w:after="0" w:line="360" w:lineRule="auto"/>
-        <w:jc w:val="both"/>
-        <w:rPr>
-          <w:rFonts w:ascii="Courier New" w:hAnsi="Courier New" w:cs="Courier New"/>
-          <w:iCs/>
-          <w:color w:val="auto"/>
-          <w:szCs w:val="24"/>
-        </w:rPr>
-      </w:pPr>
-      <w:r>
-        <w:rPr>
-          <w:rFonts w:ascii="Courier New" w:hAnsi="Courier New" w:cs="Courier New"/>
-          <w:iCs/>
-          <w:color w:val="auto"/>
-          <w:szCs w:val="24"/>
-        </w:rPr>
-        <w:t>Public users | Parish Secretary | System Administrator</w:t>
-      </w:r>
-    </w:p>
-    <w:p>
-      <w:pPr>
-        <w:pStyle w:val="CoverAudience"/>
-        <w:spacing w:after="0" w:line="360" w:lineRule="auto"/>
-        <w:jc w:val="both"/>
+        <w:jc w:val="center"/>
         <w:rPr>
           <w:rFonts w:ascii="Courier New" w:hAnsi="Courier New" w:cs="Courier New"/>
           <w:b/>
           <w:bCs/>
-          <w:iCs/>
-          <w:color w:val="auto"/>
+          <w:i w:val="0"/>
+          <w:iCs/>
+          <w:color w:val="auto"/>
+          <w:sz w:val="24"/>
           <w:szCs w:val="24"/>
         </w:rPr>
       </w:pPr>
@@ -69,887 +23,26 @@
           <w:rFonts w:ascii="Courier New" w:hAnsi="Courier New" w:cs="Courier New"/>
           <w:b/>
           <w:bCs/>
-          <w:iCs/>
-          <w:color w:val="auto"/>
-          <w:szCs w:val="24"/>
-        </w:rPr>
-        <w:t>About this manual</w:t>
-      </w:r>
-    </w:p>
-    <w:p>
-      <w:pPr>
-        <w:spacing w:after="0" w:line="360" w:lineRule="auto"/>
-        <w:ind w:firstLine="720"/>
-        <w:jc w:val="both"/>
-        <w:rPr>
-          <w:rFonts w:ascii="Courier New" w:hAnsi="Courier New" w:cs="Courier New"/>
-          <w:iCs/>
-          <w:color w:val="auto"/>
-          <w:sz w:val="24"/>
-          <w:szCs w:val="24"/>
-        </w:rPr>
-      </w:pPr>
-      <w:r>
-        <w:rPr>
-          <w:rFonts w:ascii="Courier New" w:hAnsi="Courier New" w:cs="Courier New"/>
-          <w:iCs/>
-          <w:color w:val="auto"/>
-          <w:sz w:val="24"/>
-          <w:szCs w:val="24"/>
-        </w:rPr>
-        <w:t>This manual explains how to use the Schedule and Record System of St. Patrick's Parish Office (SRS-SPPO). It is organized around the work of parishioners, the parish secretary, and the person responsible for system maintenance.</w:t>
-      </w:r>
-    </w:p>
-    <w:p>
-      <w:pPr>
-        <w:spacing w:after="0" w:line="360" w:lineRule="auto"/>
-        <w:ind w:firstLine="180"/>
-        <w:jc w:val="both"/>
-        <w:rPr>
-          <w:rFonts w:ascii="Courier New" w:hAnsi="Courier New" w:cs="Courier New"/>
-          <w:iCs/>
-          <w:color w:val="auto"/>
-          <w:sz w:val="24"/>
-          <w:szCs w:val="24"/>
-        </w:rPr>
-      </w:pPr>
-      <w:r>
-        <w:rPr>
-          <w:rFonts w:ascii="Courier New" w:hAnsi="Courier New" w:cs="Courier New"/>
-          <w:iCs/>
-          <w:color w:val="auto"/>
-          <w:sz w:val="24"/>
-          <w:szCs w:val="24"/>
-        </w:rPr>
-        <w:t>The instructions describe the application as reviewed for this draft. Screen labels and available options may change when the hosted system is updated. Follow current parish-office instructions whenever they differ from this guide.</w:t>
-      </w:r>
-    </w:p>
-    <w:p>
-      <w:pPr>
-        <w:spacing w:after="0" w:line="360" w:lineRule="auto"/>
-        <w:jc w:val="both"/>
-        <w:rPr>
-          <w:rFonts w:ascii="Courier New" w:hAnsi="Courier New" w:cs="Courier New"/>
-          <w:iCs/>
-          <w:color w:val="auto"/>
-          <w:sz w:val="24"/>
-          <w:szCs w:val="24"/>
-        </w:rPr>
-      </w:pPr>
-    </w:p>
-    <w:p>
-      <w:pPr>
-        <w:spacing w:after="0" w:line="360" w:lineRule="auto"/>
-        <w:ind w:firstLine="180"/>
-        <w:jc w:val="both"/>
-        <w:rPr>
-          <w:rFonts w:ascii="Courier New" w:hAnsi="Courier New" w:cs="Courier New"/>
-          <w:iCs/>
-          <w:color w:val="auto"/>
-          <w:sz w:val="24"/>
-          <w:szCs w:val="24"/>
-        </w:rPr>
-      </w:pPr>
-      <w:r>
+          <w:i w:val="0"/>
+          <w:iCs/>
+          <w:color w:val="auto"/>
+          <w:sz w:val="24"/>
+          <w:szCs w:val="24"/>
+        </w:rPr>
+        <w:t>USER MANUAL</w:t>
+      </w:r>
+    </w:p>
+    <w:p>
+      <w:pPr>
+        <w:pStyle w:val="CoverAudience"/>
+        <w:spacing w:after="0" w:line="360" w:lineRule="auto"/>
+        <w:jc w:val="both"/>
         <w:rPr>
           <w:rFonts w:ascii="Courier New" w:hAnsi="Courier New" w:cs="Courier New"/>
           <w:b/>
           <w:bCs/>
           <w:iCs/>
           <w:color w:val="auto"/>
-          <w:sz w:val="24"/>
-          <w:szCs w:val="24"/>
-        </w:rPr>
-        <w:t>Important:</w:t>
-      </w:r>
-      <w:r>
-        <w:rPr>
-          <w:rFonts w:ascii="Courier New" w:hAnsi="Courier New" w:cs="Courier New"/>
-          <w:iCs/>
-          <w:color w:val="auto"/>
-          <w:sz w:val="24"/>
-          <w:szCs w:val="24"/>
-        </w:rPr>
-        <w:t xml:space="preserve"> Online forms start a request or application; they do not grant approval, collect payment, or issue a certificate. Final verification and certificate pickup take place through the Parish Office.</w:t>
-      </w:r>
-    </w:p>
-    <w:p>
-      <w:pPr>
-        <w:pStyle w:val="Heading2"/>
-        <w:spacing w:after="0" w:line="360" w:lineRule="auto"/>
-        <w:jc w:val="both"/>
-        <w:rPr>
-          <w:rFonts w:ascii="Courier New" w:hAnsi="Courier New" w:cs="Courier New"/>
-          <w:iCs/>
-          <w:color w:val="auto"/>
-          <w:szCs w:val="24"/>
-        </w:rPr>
-      </w:pPr>
-      <w:r>
-        <w:rPr>
-          <w:rFonts w:ascii="Courier New" w:hAnsi="Courier New" w:cs="Courier New"/>
-          <w:iCs/>
-          <w:color w:val="auto"/>
-          <w:szCs w:val="24"/>
-        </w:rPr>
-        <w:t>Who should use each part?</w:t>
-      </w:r>
-    </w:p>
-    <w:p>
-      <w:pPr>
-        <w:pStyle w:val="ListParagraph"/>
-        <w:spacing w:after="0" w:line="360" w:lineRule="auto"/>
-        <w:jc w:val="both"/>
-        <w:rPr>
-          <w:rFonts w:ascii="Courier New" w:hAnsi="Courier New" w:cs="Courier New"/>
-          <w:iCs/>
-          <w:color w:val="auto"/>
-          <w:sz w:val="24"/>
-          <w:szCs w:val="24"/>
-        </w:rPr>
-      </w:pPr>
-      <w:r>
-        <w:rPr>
-          <w:rFonts w:ascii="Courier New" w:hAnsi="Courier New" w:cs="Courier New"/>
-          <w:iCs/>
-          <w:color w:val="auto"/>
-          <w:sz w:val="24"/>
-          <w:szCs w:val="24"/>
-        </w:rPr>
-        <w:t>•  Public users: Chapters 2-5 cover certificates, sacrament applications, status tracking, and correction requests.</w:t>
-      </w:r>
-    </w:p>
-    <w:p>
-      <w:pPr>
-        <w:pStyle w:val="ListParagraph"/>
-        <w:spacing w:after="0" w:line="360" w:lineRule="auto"/>
-        <w:jc w:val="both"/>
-        <w:rPr>
-          <w:rFonts w:ascii="Courier New" w:hAnsi="Courier New" w:cs="Courier New"/>
-          <w:iCs/>
-          <w:color w:val="auto"/>
-          <w:sz w:val="24"/>
-          <w:szCs w:val="24"/>
-        </w:rPr>
-      </w:pPr>
-      <w:r>
-        <w:rPr>
-          <w:rFonts w:ascii="Courier New" w:hAnsi="Courier New" w:cs="Courier New"/>
-          <w:iCs/>
-          <w:color w:val="auto"/>
-          <w:sz w:val="24"/>
-          <w:szCs w:val="24"/>
-        </w:rPr>
-        <w:lastRenderedPageBreak/>
-        <w:t>•  Parish Secretary: Chapters 6-10 cover staff access, request processing, records, certificates, scheduling, and reports.</w:t>
-      </w:r>
-    </w:p>
-    <w:p>
-      <w:pPr>
-        <w:pStyle w:val="ListParagraph"/>
-        <w:spacing w:after="0" w:line="360" w:lineRule="auto"/>
-        <w:jc w:val="both"/>
-        <w:rPr>
-          <w:rFonts w:ascii="Courier New" w:hAnsi="Courier New" w:cs="Courier New"/>
-          <w:iCs/>
-          <w:color w:val="auto"/>
-          <w:sz w:val="24"/>
-          <w:szCs w:val="24"/>
-        </w:rPr>
-      </w:pPr>
-      <w:r>
-        <w:rPr>
-          <w:rFonts w:ascii="Courier New" w:hAnsi="Courier New" w:cs="Courier New"/>
-          <w:iCs/>
-          <w:color w:val="auto"/>
-          <w:sz w:val="24"/>
-          <w:szCs w:val="24"/>
-        </w:rPr>
-        <w:t>•  System Administrator: Chapter 11 covers system-maintenance tasks. There is only one staff role, Secretary; in-app tasks use the same Secretary accounts, while hosting, recovery, and database restoration are handled by the designated technical administrator.</w:t>
-      </w:r>
-    </w:p>
-    <w:p>
-      <w:pPr>
-        <w:pStyle w:val="Heading2"/>
-        <w:spacing w:after="0" w:line="360" w:lineRule="auto"/>
-        <w:jc w:val="both"/>
-        <w:rPr>
-          <w:rFonts w:ascii="Courier New" w:hAnsi="Courier New" w:cs="Courier New"/>
-          <w:iCs/>
-          <w:color w:val="auto"/>
-          <w:szCs w:val="24"/>
-        </w:rPr>
-      </w:pPr>
-      <w:r>
-        <w:rPr>
-          <w:rFonts w:ascii="Courier New" w:hAnsi="Courier New" w:cs="Courier New"/>
-          <w:iCs/>
-          <w:color w:val="auto"/>
-          <w:szCs w:val="24"/>
-        </w:rPr>
-        <w:t>Contents</w:t>
-      </w:r>
-    </w:p>
-    <w:p>
-      <w:pPr>
-        <w:pStyle w:val="ListParagraph"/>
-        <w:spacing w:after="0" w:line="360" w:lineRule="auto"/>
-        <w:jc w:val="both"/>
-        <w:rPr>
-          <w:rFonts w:ascii="Courier New" w:hAnsi="Courier New" w:cs="Courier New"/>
-          <w:iCs/>
-          <w:color w:val="auto"/>
-          <w:sz w:val="24"/>
-          <w:szCs w:val="24"/>
-        </w:rPr>
-      </w:pPr>
-      <w:r>
-        <w:rPr>
-          <w:rFonts w:ascii="Courier New" w:hAnsi="Courier New" w:cs="Courier New"/>
-          <w:iCs/>
-          <w:color w:val="auto"/>
-          <w:sz w:val="24"/>
-          <w:szCs w:val="24"/>
-        </w:rPr>
-        <w:t>•  1. Getting started and user roles</w:t>
-      </w:r>
-    </w:p>
-    <w:p>
-      <w:pPr>
-        <w:pStyle w:val="ListParagraph"/>
-        <w:spacing w:after="0" w:line="360" w:lineRule="auto"/>
-        <w:jc w:val="both"/>
-        <w:rPr>
-          <w:rFonts w:ascii="Courier New" w:hAnsi="Courier New" w:cs="Courier New"/>
-          <w:iCs/>
-          <w:color w:val="auto"/>
-          <w:sz w:val="24"/>
-          <w:szCs w:val="24"/>
-        </w:rPr>
-      </w:pPr>
-      <w:r>
-        <w:rPr>
-          <w:rFonts w:ascii="Courier New" w:hAnsi="Courier New" w:cs="Courier New"/>
-          <w:iCs/>
-          <w:color w:val="auto"/>
-          <w:sz w:val="24"/>
-          <w:szCs w:val="24"/>
-        </w:rPr>
-        <w:t>•  2. Public home page and office services</w:t>
-      </w:r>
-    </w:p>
-    <w:p>
-      <w:pPr>
-        <w:pStyle w:val="ListParagraph"/>
-        <w:spacing w:after="0" w:line="360" w:lineRule="auto"/>
-        <w:jc w:val="both"/>
-        <w:rPr>
-          <w:rFonts w:ascii="Courier New" w:hAnsi="Courier New" w:cs="Courier New"/>
-          <w:iCs/>
-          <w:color w:val="auto"/>
-          <w:sz w:val="24"/>
-          <w:szCs w:val="24"/>
-        </w:rPr>
-      </w:pPr>
-      <w:r>
-        <w:rPr>
-          <w:rFonts w:ascii="Courier New" w:hAnsi="Courier New" w:cs="Courier New"/>
-          <w:iCs/>
-          <w:color w:val="auto"/>
-          <w:sz w:val="24"/>
-          <w:szCs w:val="24"/>
-        </w:rPr>
-        <w:t>•  3. Requesting a sacramental certificate</w:t>
-      </w:r>
-    </w:p>
-    <w:p>
-      <w:pPr>
-        <w:pStyle w:val="ListParagraph"/>
-        <w:spacing w:after="0" w:line="360" w:lineRule="auto"/>
-        <w:jc w:val="both"/>
-        <w:rPr>
-          <w:rFonts w:ascii="Courier New" w:hAnsi="Courier New" w:cs="Courier New"/>
-          <w:iCs/>
-          <w:color w:val="auto"/>
-          <w:sz w:val="24"/>
-          <w:szCs w:val="24"/>
-        </w:rPr>
-      </w:pPr>
-      <w:r>
-        <w:rPr>
-          <w:rFonts w:ascii="Courier New" w:hAnsi="Courier New" w:cs="Courier New"/>
-          <w:iCs/>
-          <w:color w:val="auto"/>
-          <w:sz w:val="24"/>
-          <w:szCs w:val="24"/>
-        </w:rPr>
-        <w:t>•  4. Applying to receive a sacrament</w:t>
-      </w:r>
-    </w:p>
-    <w:p>
-      <w:pPr>
-        <w:pStyle w:val="ListParagraph"/>
-        <w:spacing w:after="0" w:line="360" w:lineRule="auto"/>
-        <w:jc w:val="both"/>
-        <w:rPr>
-          <w:rFonts w:ascii="Courier New" w:hAnsi="Courier New" w:cs="Courier New"/>
-          <w:iCs/>
-          <w:color w:val="auto"/>
-          <w:sz w:val="24"/>
-          <w:szCs w:val="24"/>
-        </w:rPr>
-      </w:pPr>
-      <w:r>
-        <w:rPr>
-          <w:rFonts w:ascii="Courier New" w:hAnsi="Courier New" w:cs="Courier New"/>
-          <w:iCs/>
-          <w:color w:val="auto"/>
-          <w:sz w:val="24"/>
-          <w:szCs w:val="24"/>
-        </w:rPr>
-        <w:t>•  5. Tracking a submission and requesting a correction</w:t>
-      </w:r>
-    </w:p>
-    <w:p>
-      <w:pPr>
-        <w:pStyle w:val="ListParagraph"/>
-        <w:spacing w:after="0" w:line="360" w:lineRule="auto"/>
-        <w:jc w:val="both"/>
-        <w:rPr>
-          <w:rFonts w:ascii="Courier New" w:hAnsi="Courier New" w:cs="Courier New"/>
-          <w:iCs/>
-          <w:color w:val="auto"/>
-          <w:sz w:val="24"/>
-          <w:szCs w:val="24"/>
-        </w:rPr>
-      </w:pPr>
-      <w:r>
-        <w:rPr>
-          <w:rFonts w:ascii="Courier New" w:hAnsi="Courier New" w:cs="Courier New"/>
-          <w:iCs/>
-          <w:color w:val="auto"/>
-          <w:sz w:val="24"/>
-          <w:szCs w:val="24"/>
-        </w:rPr>
-        <w:t>•  6. Secretary sign-in and dashboard</w:t>
-      </w:r>
-    </w:p>
-    <w:p>
-      <w:pPr>
-        <w:pStyle w:val="ListParagraph"/>
-        <w:spacing w:after="0" w:line="360" w:lineRule="auto"/>
-        <w:jc w:val="both"/>
-        <w:rPr>
-          <w:rFonts w:ascii="Courier New" w:hAnsi="Courier New" w:cs="Courier New"/>
-          <w:iCs/>
-          <w:color w:val="auto"/>
-          <w:sz w:val="24"/>
-          <w:szCs w:val="24"/>
-        </w:rPr>
-      </w:pPr>
-      <w:r>
-        <w:rPr>
-          <w:rFonts w:ascii="Courier New" w:hAnsi="Courier New" w:cs="Courier New"/>
-          <w:iCs/>
-          <w:color w:val="auto"/>
-          <w:sz w:val="24"/>
-          <w:szCs w:val="24"/>
-        </w:rPr>
-        <w:t>•  7. Reviewing certificate requests</w:t>
-      </w:r>
-    </w:p>
-    <w:p>
-      <w:pPr>
-        <w:pStyle w:val="ListParagraph"/>
-        <w:spacing w:after="0" w:line="360" w:lineRule="auto"/>
-        <w:jc w:val="both"/>
-        <w:rPr>
-          <w:rFonts w:ascii="Courier New" w:hAnsi="Courier New" w:cs="Courier New"/>
-          <w:iCs/>
-          <w:color w:val="auto"/>
-          <w:sz w:val="24"/>
-          <w:szCs w:val="24"/>
-        </w:rPr>
-      </w:pPr>
-      <w:r>
-        <w:rPr>
-          <w:rFonts w:ascii="Courier New" w:hAnsi="Courier New" w:cs="Courier New"/>
-          <w:iCs/>
-          <w:color w:val="auto"/>
-          <w:sz w:val="24"/>
-          <w:szCs w:val="24"/>
-        </w:rPr>
-        <w:t>•  Processing correction requests (Chapter 7)</w:t>
-      </w:r>
-    </w:p>
-    <w:p>
-      <w:pPr>
-        <w:pStyle w:val="ListParagraph"/>
-        <w:spacing w:after="0" w:line="360" w:lineRule="auto"/>
-        <w:jc w:val="both"/>
-        <w:rPr>
-          <w:rFonts w:ascii="Courier New" w:hAnsi="Courier New" w:cs="Courier New"/>
-          <w:iCs/>
-          <w:color w:val="auto"/>
-          <w:sz w:val="24"/>
-          <w:szCs w:val="24"/>
-        </w:rPr>
-      </w:pPr>
-      <w:r>
-        <w:rPr>
-          <w:rFonts w:ascii="Courier New" w:hAnsi="Courier New" w:cs="Courier New"/>
-          <w:iCs/>
-          <w:color w:val="auto"/>
-          <w:sz w:val="24"/>
-          <w:szCs w:val="24"/>
-        </w:rPr>
-        <w:t>•  8. Reviewing applications and managing sacramental records</w:t>
-      </w:r>
-    </w:p>
-    <w:p>
-      <w:pPr>
-        <w:pStyle w:val="ListParagraph"/>
-        <w:spacing w:after="0" w:line="360" w:lineRule="auto"/>
-        <w:jc w:val="both"/>
-        <w:rPr>
-          <w:rFonts w:ascii="Courier New" w:hAnsi="Courier New" w:cs="Courier New"/>
-          <w:iCs/>
-          <w:color w:val="auto"/>
-          <w:sz w:val="24"/>
-          <w:szCs w:val="24"/>
-          <w:lang w:val="en-US"/>
-        </w:rPr>
-      </w:pPr>
-    </w:p>
-    <w:p>
-      <w:pPr>
-        <w:pStyle w:val="ListParagraph"/>
-        <w:spacing w:after="0" w:line="360" w:lineRule="auto"/>
-        <w:jc w:val="both"/>
-        <w:rPr>
-          <w:rFonts w:ascii="Courier New" w:hAnsi="Courier New" w:cs="Courier New"/>
-          <w:iCs/>
-          <w:color w:val="auto"/>
-          <w:sz w:val="24"/>
-          <w:szCs w:val="24"/>
-          <w:lang w:val="en-US"/>
-        </w:rPr>
-      </w:pPr>
-      <w:r>
-        <w:rPr>
-          <w:rFonts w:ascii="Courier New" w:hAnsi="Courier New" w:cs="Courier New"/>
-          <w:iCs/>
-          <w:color w:val="auto"/>
-          <w:sz w:val="24"/>
-          <w:szCs w:val="24"/>
-          <w:lang w:val="en-US"/>
-        </w:rPr>
-        <w:t>•  Worked example: Baptismal record and walk-in request (Chapter 8)</w:t>
-      </w:r>
-    </w:p>
-    <w:p>
-      <w:pPr>
-        <w:pStyle w:val="ListParagraph"/>
-        <w:spacing w:after="0" w:line="360" w:lineRule="auto"/>
-        <w:jc w:val="both"/>
-        <w:rPr>
-          <w:rFonts w:ascii="Courier New" w:hAnsi="Courier New" w:cs="Courier New"/>
-          <w:iCs/>
-          <w:color w:val="auto"/>
-          <w:sz w:val="24"/>
-          <w:szCs w:val="24"/>
-          <w:lang w:val="en-US"/>
-        </w:rPr>
-      </w:pPr>
-      <w:r>
-        <w:rPr>
-          <w:rFonts w:ascii="Courier New" w:hAnsi="Courier New" w:cs="Courier New"/>
-          <w:iCs/>
-          <w:color w:val="auto"/>
-          <w:sz w:val="24"/>
-          <w:szCs w:val="24"/>
-          <w:lang w:val="en-US"/>
-        </w:rPr>
-        <w:lastRenderedPageBreak/>
-        <w:t>•  9. Generating certificates and recording pickup</w:t>
-      </w:r>
-    </w:p>
-    <w:p>
-      <w:pPr>
-        <w:pStyle w:val="ListParagraph"/>
-        <w:spacing w:after="0" w:line="360" w:lineRule="auto"/>
-        <w:jc w:val="both"/>
-        <w:rPr>
-          <w:rFonts w:ascii="Courier New" w:hAnsi="Courier New" w:cs="Courier New"/>
-          <w:iCs/>
-          <w:color w:val="auto"/>
-          <w:sz w:val="24"/>
-          <w:szCs w:val="24"/>
-        </w:rPr>
-      </w:pPr>
-      <w:r>
-        <w:rPr>
-          <w:rFonts w:ascii="Courier New" w:hAnsi="Courier New" w:cs="Courier New"/>
-          <w:iCs/>
-          <w:color w:val="auto"/>
-          <w:sz w:val="24"/>
-          <w:szCs w:val="24"/>
-        </w:rPr>
-        <w:t>•  10. Calendar, announcements, and reports</w:t>
-      </w:r>
-    </w:p>
-    <w:p>
-      <w:pPr>
-        <w:pStyle w:val="ListParagraph"/>
-        <w:spacing w:after="0" w:line="360" w:lineRule="auto"/>
-        <w:jc w:val="both"/>
-        <w:rPr>
-          <w:rFonts w:ascii="Courier New" w:hAnsi="Courier New" w:cs="Courier New"/>
-          <w:iCs/>
-          <w:color w:val="auto"/>
-          <w:sz w:val="24"/>
-          <w:szCs w:val="24"/>
-        </w:rPr>
-      </w:pPr>
-      <w:r>
-        <w:rPr>
-          <w:rFonts w:ascii="Courier New" w:hAnsi="Courier New" w:cs="Courier New"/>
-          <w:iCs/>
-          <w:color w:val="auto"/>
-          <w:sz w:val="24"/>
-          <w:szCs w:val="24"/>
-        </w:rPr>
-        <w:t>•  11. System administration and backups</w:t>
-      </w:r>
-    </w:p>
-    <w:p>
-      <w:pPr>
-        <w:pStyle w:val="ListParagraph"/>
-        <w:spacing w:after="0" w:line="360" w:lineRule="auto"/>
-        <w:jc w:val="both"/>
-        <w:rPr>
-          <w:rFonts w:ascii="Courier New" w:hAnsi="Courier New" w:cs="Courier New"/>
-          <w:iCs/>
-          <w:color w:val="auto"/>
-          <w:sz w:val="24"/>
-          <w:szCs w:val="24"/>
-        </w:rPr>
-      </w:pPr>
-      <w:r>
-        <w:rPr>
-          <w:rFonts w:ascii="Courier New" w:hAnsi="Courier New" w:cs="Courier New"/>
-          <w:iCs/>
-          <w:color w:val="auto"/>
-          <w:sz w:val="24"/>
-          <w:szCs w:val="24"/>
-        </w:rPr>
-        <w:t>•  12. Troubleshooting and quick reference</w:t>
-      </w:r>
-    </w:p>
-    <w:p>
-      <w:pPr>
-        <w:spacing w:after="0" w:line="360" w:lineRule="auto"/>
-        <w:jc w:val="both"/>
-        <w:rPr>
-          <w:rFonts w:ascii="Courier New" w:hAnsi="Courier New" w:cs="Courier New"/>
-          <w:iCs/>
-          <w:color w:val="auto"/>
-          <w:sz w:val="24"/>
-          <w:szCs w:val="24"/>
-        </w:rPr>
-      </w:pPr>
-    </w:p>
-    <w:p>
-      <w:pPr>
-        <w:pStyle w:val="Heading1"/>
-        <w:spacing w:after="0" w:line="360" w:lineRule="auto"/>
-        <w:jc w:val="both"/>
-        <w:rPr>
-          <w:rFonts w:ascii="Courier New" w:hAnsi="Courier New" w:cs="Courier New"/>
-          <w:iCs/>
-          <w:color w:val="auto"/>
-          <w:sz w:val="24"/>
-          <w:szCs w:val="24"/>
-        </w:rPr>
-      </w:pPr>
-      <w:r>
-        <w:rPr>
-          <w:rFonts w:ascii="Courier New" w:hAnsi="Courier New" w:cs="Courier New"/>
-          <w:iCs/>
-          <w:color w:val="auto"/>
-          <w:sz w:val="24"/>
-          <w:szCs w:val="24"/>
-        </w:rPr>
-        <w:t>1. Getting started and user roles</w:t>
-      </w:r>
-    </w:p>
-    <w:p>
-      <w:pPr>
-        <w:pStyle w:val="Heading2"/>
-        <w:spacing w:after="0" w:line="360" w:lineRule="auto"/>
-        <w:jc w:val="both"/>
-        <w:rPr>
-          <w:rFonts w:ascii="Courier New" w:hAnsi="Courier New" w:cs="Courier New"/>
-          <w:iCs/>
-          <w:color w:val="auto"/>
-          <w:szCs w:val="24"/>
-        </w:rPr>
-      </w:pPr>
-      <w:r>
-        <w:rPr>
-          <w:rFonts w:ascii="Courier New" w:hAnsi="Courier New" w:cs="Courier New"/>
-          <w:iCs/>
-          <w:color w:val="auto"/>
-          <w:szCs w:val="24"/>
-        </w:rPr>
-        <w:t>What the system does</w:t>
-      </w:r>
-    </w:p>
-    <w:p>
-      <w:pPr>
-        <w:spacing w:after="0" w:line="360" w:lineRule="auto"/>
-        <w:jc w:val="both"/>
-        <w:rPr>
-          <w:rFonts w:ascii="Courier New" w:hAnsi="Courier New" w:cs="Courier New"/>
-          <w:iCs/>
-          <w:color w:val="auto"/>
-          <w:sz w:val="24"/>
-          <w:szCs w:val="24"/>
-        </w:rPr>
-      </w:pPr>
-      <w:r>
-        <w:rPr>
-          <w:rFonts w:ascii="Courier New" w:hAnsi="Courier New" w:cs="Courier New"/>
-          <w:iCs/>
-          <w:color w:val="auto"/>
-          <w:sz w:val="24"/>
-          <w:szCs w:val="24"/>
-        </w:rPr>
-        <w:t>SRS-SPPO supports parish service intake, sacramental-record keeping, certificate processing, scheduling, and office reporting. Public visitors can submit information without creating an account. Authorized staff sign in to review and process work.</w:t>
-      </w:r>
-    </w:p>
-    <w:p>
-      <w:pPr>
-        <w:pStyle w:val="Heading2"/>
-        <w:spacing w:after="0" w:line="360" w:lineRule="auto"/>
-        <w:jc w:val="both"/>
-        <w:rPr>
-          <w:rFonts w:ascii="Courier New" w:hAnsi="Courier New" w:cs="Courier New"/>
-          <w:iCs/>
-          <w:color w:val="auto"/>
-          <w:szCs w:val="24"/>
-        </w:rPr>
-      </w:pPr>
-      <w:r>
-        <w:rPr>
-          <w:rFonts w:ascii="Courier New" w:hAnsi="Courier New" w:cs="Courier New"/>
-          <w:iCs/>
-          <w:color w:val="auto"/>
-          <w:szCs w:val="24"/>
-        </w:rPr>
-        <w:t>Access points</w:t>
-      </w:r>
-    </w:p>
-    <w:p>
-      <w:pPr>
-        <w:pStyle w:val="ListParagraph"/>
-        <w:spacing w:after="0" w:line="360" w:lineRule="auto"/>
-        <w:jc w:val="both"/>
-        <w:rPr>
-          <w:rFonts w:ascii="Courier New" w:hAnsi="Courier New" w:cs="Courier New"/>
-          <w:iCs/>
-          <w:color w:val="auto"/>
-          <w:sz w:val="24"/>
-          <w:szCs w:val="24"/>
-        </w:rPr>
-      </w:pPr>
-      <w:r>
-        <w:rPr>
-          <w:rFonts w:ascii="Courier New" w:hAnsi="Courier New" w:cs="Courier New"/>
-          <w:iCs/>
-          <w:color w:val="auto"/>
-          <w:sz w:val="24"/>
-          <w:szCs w:val="24"/>
-        </w:rPr>
-        <w:t>•  Public website: use the official parish link provided by the Parish Office. The home page includes service links, requirements, a calendar, and request tracking.</w:t>
-      </w:r>
-    </w:p>
-    <w:p>
-      <w:pPr>
-        <w:pStyle w:val="ListParagraph"/>
-        <w:spacing w:after="0" w:line="360" w:lineRule="auto"/>
-        <w:jc w:val="both"/>
-        <w:rPr>
-          <w:rFonts w:ascii="Courier New" w:hAnsi="Courier New" w:cs="Courier New"/>
-          <w:iCs/>
-          <w:color w:val="auto"/>
-          <w:sz w:val="24"/>
-          <w:szCs w:val="24"/>
-        </w:rPr>
-      </w:pPr>
-      <w:r>
-        <w:rPr>
-          <w:rFonts w:ascii="Courier New" w:hAnsi="Courier New" w:cs="Courier New"/>
-          <w:iCs/>
-          <w:color w:val="auto"/>
-          <w:sz w:val="24"/>
-          <w:szCs w:val="24"/>
-        </w:rPr>
-        <w:t>•  Staff area: open the staff login link supplied by the Parish Office. Staff pages require an active account.</w:t>
-      </w:r>
-    </w:p>
-    <w:p>
-      <w:pPr>
-        <w:pStyle w:val="ListParagraph"/>
-        <w:spacing w:after="0" w:line="360" w:lineRule="auto"/>
-        <w:jc w:val="both"/>
-        <w:rPr>
-          <w:rFonts w:ascii="Courier New" w:hAnsi="Courier New" w:cs="Courier New"/>
-          <w:iCs/>
-          <w:color w:val="auto"/>
-          <w:sz w:val="24"/>
-          <w:szCs w:val="24"/>
-        </w:rPr>
-      </w:pPr>
-      <w:r>
-        <w:rPr>
-          <w:rFonts w:ascii="Courier New" w:hAnsi="Courier New" w:cs="Courier New"/>
-          <w:iCs/>
-          <w:color w:val="auto"/>
-          <w:sz w:val="24"/>
-          <w:szCs w:val="24"/>
-        </w:rPr>
-        <w:t xml:space="preserve">•  A local development URL such as http://localhost/srs-sppo is for the </w:t>
-      </w:r>
-      <w:r>
-        <w:rPr>
-          <w:rFonts w:ascii="Courier New" w:hAnsi="Courier New" w:cs="Courier New"/>
-          <w:iCs/>
-          <w:color w:val="auto"/>
-          <w:sz w:val="24"/>
-          <w:szCs w:val="24"/>
-        </w:rPr>
-        <w:lastRenderedPageBreak/>
-        <w:t>local test installation only; it is not the public hosted address.</w:t>
-      </w:r>
-    </w:p>
-    <w:p>
-      <w:pPr>
-        <w:pStyle w:val="Heading2"/>
-        <w:spacing w:after="0" w:line="360" w:lineRule="auto"/>
-        <w:jc w:val="both"/>
-        <w:rPr>
-          <w:rFonts w:ascii="Courier New" w:hAnsi="Courier New" w:cs="Courier New"/>
-          <w:iCs/>
-          <w:color w:val="auto"/>
-          <w:szCs w:val="24"/>
-        </w:rPr>
-      </w:pPr>
-      <w:r>
-        <w:rPr>
-          <w:rFonts w:ascii="Courier New" w:hAnsi="Courier New" w:cs="Courier New"/>
-          <w:iCs/>
-          <w:color w:val="auto"/>
-          <w:szCs w:val="24"/>
-        </w:rPr>
-        <w:t>Roles and responsibilities</w:t>
-      </w:r>
-    </w:p>
-    <w:p>
-      <w:pPr>
-        <w:pStyle w:val="ListParagraph"/>
-        <w:spacing w:after="0" w:line="360" w:lineRule="auto"/>
-        <w:jc w:val="both"/>
-        <w:rPr>
-          <w:rFonts w:ascii="Courier New" w:hAnsi="Courier New" w:cs="Courier New"/>
-          <w:iCs/>
-          <w:color w:val="auto"/>
-          <w:sz w:val="24"/>
-          <w:szCs w:val="24"/>
-        </w:rPr>
-      </w:pPr>
-      <w:r>
-        <w:rPr>
-          <w:rFonts w:ascii="Courier New" w:hAnsi="Courier New" w:cs="Courier New"/>
-          <w:iCs/>
-          <w:color w:val="auto"/>
-          <w:sz w:val="24"/>
-          <w:szCs w:val="24"/>
-        </w:rPr>
-        <w:t>•  Public visitor: supplies accurate information, keeps the tracking number, and follows office directions.</w:t>
-      </w:r>
-    </w:p>
-    <w:p>
-      <w:pPr>
-        <w:pStyle w:val="ListParagraph"/>
-        <w:spacing w:after="0" w:line="360" w:lineRule="auto"/>
-        <w:jc w:val="both"/>
-        <w:rPr>
-          <w:rFonts w:ascii="Courier New" w:hAnsi="Courier New" w:cs="Courier New"/>
-          <w:iCs/>
-          <w:color w:val="auto"/>
-          <w:sz w:val="24"/>
-          <w:szCs w:val="24"/>
-        </w:rPr>
-      </w:pPr>
-      <w:r>
-        <w:rPr>
-          <w:rFonts w:ascii="Courier New" w:hAnsi="Courier New" w:cs="Courier New"/>
-          <w:iCs/>
-          <w:color w:val="auto"/>
-          <w:sz w:val="24"/>
-          <w:szCs w:val="24"/>
-        </w:rPr>
-        <w:t>•  Parish Secretary: reviews submissions, verifies information, updates workflow status, maintains records, schedules events, and prepares reports.</w:t>
-      </w:r>
-    </w:p>
-    <w:p>
-      <w:pPr>
-        <w:pStyle w:val="ListParagraph"/>
-        <w:spacing w:after="0" w:line="360" w:lineRule="auto"/>
-        <w:jc w:val="both"/>
-        <w:rPr>
-          <w:rFonts w:ascii="Courier New" w:hAnsi="Courier New" w:cs="Courier New"/>
-          <w:iCs/>
-          <w:color w:val="auto"/>
-          <w:sz w:val="24"/>
-          <w:szCs w:val="24"/>
-        </w:rPr>
-      </w:pPr>
-      <w:r>
-        <w:rPr>
-          <w:rFonts w:ascii="Courier New" w:hAnsi="Courier New" w:cs="Courier New"/>
-          <w:iCs/>
-          <w:color w:val="auto"/>
-          <w:sz w:val="24"/>
-          <w:szCs w:val="24"/>
-        </w:rPr>
-        <w:t>•  System maintainer: uses the same Secretary staff account for in-app maintenance, protects staff access, applies approved database updates, and creates protected backups. The designated technical administrator handles hosting, recovery, and database restoration.</w:t>
-      </w:r>
-    </w:p>
-    <w:p>
-      <w:pPr>
-        <w:spacing w:after="0" w:line="360" w:lineRule="auto"/>
-        <w:jc w:val="both"/>
-        <w:rPr>
-          <w:rFonts w:ascii="Courier New" w:hAnsi="Courier New" w:cs="Courier New"/>
-          <w:iCs/>
-          <w:color w:val="auto"/>
-          <w:sz w:val="24"/>
-          <w:szCs w:val="24"/>
-        </w:rPr>
-      </w:pPr>
-    </w:p>
-    <w:p>
-      <w:pPr>
-        <w:spacing w:after="0" w:line="360" w:lineRule="auto"/>
-        <w:ind w:firstLine="120"/>
-        <w:jc w:val="both"/>
-        <w:rPr>
-          <w:rFonts w:ascii="Courier New" w:hAnsi="Courier New" w:cs="Courier New"/>
-          <w:iCs/>
-          <w:color w:val="auto"/>
-          <w:sz w:val="24"/>
           <w:szCs w:val="24"/>
         </w:rPr>
       </w:pPr>
@@ -960,6 +53,895 @@
           <w:bCs/>
           <w:iCs/>
           <w:color w:val="auto"/>
+          <w:szCs w:val="24"/>
+        </w:rPr>
+        <w:t>About this manual</w:t>
+      </w:r>
+    </w:p>
+    <w:p>
+      <w:pPr>
+        <w:spacing w:after="0" w:line="360" w:lineRule="auto"/>
+        <w:ind w:firstLine="720"/>
+        <w:jc w:val="both"/>
+        <w:rPr>
+          <w:rFonts w:ascii="Courier New" w:hAnsi="Courier New" w:cs="Courier New"/>
+          <w:iCs/>
+          <w:color w:val="auto"/>
+          <w:sz w:val="24"/>
+          <w:szCs w:val="24"/>
+        </w:rPr>
+      </w:pPr>
+      <w:r>
+        <w:rPr>
+          <w:rFonts w:ascii="Courier New" w:hAnsi="Courier New" w:cs="Courier New"/>
+          <w:iCs/>
+          <w:color w:val="auto"/>
+          <w:sz w:val="24"/>
+          <w:szCs w:val="24"/>
+        </w:rPr>
+        <w:t>This manual explains how to use the Schedule and Record System of St. Patrick's Parish Office (SRS-SPPO). It is organized around the work of parishioners, the parish secretary, and the person responsible for system maintenance.</w:t>
+      </w:r>
+    </w:p>
+    <w:p>
+      <w:pPr>
+        <w:spacing w:after="0" w:line="360" w:lineRule="auto"/>
+        <w:ind w:firstLine="180"/>
+        <w:jc w:val="both"/>
+        <w:rPr>
+          <w:rFonts w:ascii="Courier New" w:hAnsi="Courier New" w:cs="Courier New"/>
+          <w:iCs/>
+          <w:color w:val="auto"/>
+          <w:sz w:val="24"/>
+          <w:szCs w:val="24"/>
+        </w:rPr>
+      </w:pPr>
+      <w:r>
+        <w:rPr>
+          <w:rFonts w:ascii="Courier New" w:hAnsi="Courier New" w:cs="Courier New"/>
+          <w:iCs/>
+          <w:color w:val="auto"/>
+          <w:sz w:val="24"/>
+          <w:szCs w:val="24"/>
+        </w:rPr>
+        <w:t>The instructions describe the application as reviewed for this draft. Screen labels and available options may change when the hosted system is updated. Follow current parish-office instructions whenever they differ from this guide.</w:t>
+      </w:r>
+    </w:p>
+    <w:p>
+      <w:pPr>
+        <w:spacing w:after="0" w:line="360" w:lineRule="auto"/>
+        <w:jc w:val="both"/>
+        <w:rPr>
+          <w:rFonts w:ascii="Courier New" w:hAnsi="Courier New" w:cs="Courier New"/>
+          <w:iCs/>
+          <w:color w:val="auto"/>
+          <w:sz w:val="24"/>
+          <w:szCs w:val="24"/>
+        </w:rPr>
+      </w:pPr>
+    </w:p>
+    <w:p>
+      <w:pPr>
+        <w:spacing w:after="0" w:line="360" w:lineRule="auto"/>
+        <w:ind w:firstLine="180"/>
+        <w:jc w:val="both"/>
+        <w:rPr>
+          <w:rFonts w:ascii="Courier New" w:hAnsi="Courier New" w:cs="Courier New"/>
+          <w:iCs/>
+          <w:color w:val="auto"/>
+          <w:sz w:val="24"/>
+          <w:szCs w:val="24"/>
+        </w:rPr>
+      </w:pPr>
+      <w:r>
+        <w:rPr>
+          <w:rFonts w:ascii="Courier New" w:hAnsi="Courier New" w:cs="Courier New"/>
+          <w:b/>
+          <w:bCs/>
+          <w:iCs/>
+          <w:color w:val="auto"/>
+          <w:sz w:val="24"/>
+          <w:szCs w:val="24"/>
+        </w:rPr>
+        <w:t>Important:</w:t>
+      </w:r>
+      <w:r>
+        <w:rPr>
+          <w:rFonts w:ascii="Courier New" w:hAnsi="Courier New" w:cs="Courier New"/>
+          <w:iCs/>
+          <w:color w:val="auto"/>
+          <w:sz w:val="24"/>
+          <w:szCs w:val="24"/>
+        </w:rPr>
+        <w:t xml:space="preserve"> Online forms start a request or application; they do not grant approval, collect payment, or issue a certificate. Final verification and certificate pickup take place through the Parish Office.</w:t>
+      </w:r>
+    </w:p>
+    <w:p>
+      <w:pPr>
+        <w:pStyle w:val="Heading2"/>
+        <w:spacing w:after="0" w:line="360" w:lineRule="auto"/>
+        <w:jc w:val="both"/>
+        <w:rPr>
+          <w:rFonts w:ascii="Courier New" w:hAnsi="Courier New" w:cs="Courier New"/>
+          <w:iCs/>
+          <w:color w:val="auto"/>
+          <w:szCs w:val="24"/>
+        </w:rPr>
+      </w:pPr>
+      <w:r>
+        <w:rPr>
+          <w:rFonts w:ascii="Courier New" w:hAnsi="Courier New" w:cs="Courier New"/>
+          <w:iCs/>
+          <w:color w:val="auto"/>
+          <w:szCs w:val="24"/>
+        </w:rPr>
+        <w:t>Who should use each part?</w:t>
+      </w:r>
+    </w:p>
+    <w:p>
+      <w:pPr>
+        <w:pStyle w:val="ListParagraph"/>
+        <w:spacing w:after="0" w:line="360" w:lineRule="auto"/>
+        <w:jc w:val="both"/>
+        <w:rPr>
+          <w:rFonts w:ascii="Courier New" w:hAnsi="Courier New" w:cs="Courier New"/>
+          <w:iCs/>
+          <w:color w:val="auto"/>
+          <w:sz w:val="24"/>
+          <w:szCs w:val="24"/>
+        </w:rPr>
+      </w:pPr>
+      <w:r>
+        <w:rPr>
+          <w:rFonts w:ascii="Courier New" w:hAnsi="Courier New" w:cs="Courier New"/>
+          <w:iCs/>
+          <w:color w:val="auto"/>
+          <w:sz w:val="24"/>
+          <w:szCs w:val="24"/>
+        </w:rPr>
+        <w:t>•  Public users: Chapters 2-5 cover certificates, sacrament applications, status tracking, and correction requests.</w:t>
+      </w:r>
+    </w:p>
+    <w:p>
+      <w:pPr>
+        <w:pStyle w:val="ListParagraph"/>
+        <w:spacing w:after="0" w:line="360" w:lineRule="auto"/>
+        <w:jc w:val="both"/>
+        <w:rPr>
+          <w:rFonts w:ascii="Courier New" w:hAnsi="Courier New" w:cs="Courier New"/>
+          <w:iCs/>
+          <w:color w:val="auto"/>
+          <w:sz w:val="24"/>
+          <w:szCs w:val="24"/>
+        </w:rPr>
+      </w:pPr>
+      <w:r>
+        <w:rPr>
+          <w:rFonts w:ascii="Courier New" w:hAnsi="Courier New" w:cs="Courier New"/>
+          <w:iCs/>
+          <w:color w:val="auto"/>
+          <w:sz w:val="24"/>
+          <w:szCs w:val="24"/>
+        </w:rPr>
+        <w:t xml:space="preserve">•  Parish Secretary: Chapters 6-10 cover staff access, request processing, </w:t>
+      </w:r>
+      <w:r>
+        <w:rPr>
+          <w:rFonts w:ascii="Courier New" w:hAnsi="Courier New" w:cs="Courier New"/>
+          <w:iCs/>
+          <w:color w:val="auto"/>
+          <w:sz w:val="24"/>
+          <w:szCs w:val="24"/>
+        </w:rPr>
+        <w:lastRenderedPageBreak/>
+        <w:t>records, certificates, scheduling, and reports.</w:t>
+      </w:r>
+    </w:p>
+    <w:p>
+      <w:pPr>
+        <w:pStyle w:val="ListParagraph"/>
+        <w:spacing w:after="0" w:line="360" w:lineRule="auto"/>
+        <w:jc w:val="both"/>
+        <w:rPr>
+          <w:rFonts w:ascii="Courier New" w:hAnsi="Courier New" w:cs="Courier New"/>
+          <w:iCs/>
+          <w:color w:val="auto"/>
+          <w:sz w:val="24"/>
+          <w:szCs w:val="24"/>
+        </w:rPr>
+      </w:pPr>
+      <w:r>
+        <w:rPr>
+          <w:rFonts w:ascii="Courier New" w:hAnsi="Courier New" w:cs="Courier New"/>
+          <w:iCs/>
+          <w:color w:val="auto"/>
+          <w:sz w:val="24"/>
+          <w:szCs w:val="24"/>
+        </w:rPr>
+        <w:t>•  System Administrator: Chapter 11 covers system-maintenance tasks. There is only one staff role, Secretary; in-app tasks use the same Secretary accounts, while hosting, recovery, and database restoration are handled by the designated technical administrator.</w:t>
+      </w:r>
+    </w:p>
+    <w:p>
+      <w:pPr>
+        <w:pStyle w:val="Heading2"/>
+        <w:spacing w:after="0" w:line="360" w:lineRule="auto"/>
+        <w:jc w:val="both"/>
+        <w:rPr>
+          <w:rFonts w:ascii="Courier New" w:hAnsi="Courier New" w:cs="Courier New"/>
+          <w:iCs/>
+          <w:color w:val="auto"/>
+          <w:szCs w:val="24"/>
+        </w:rPr>
+      </w:pPr>
+      <w:r>
+        <w:rPr>
+          <w:rFonts w:ascii="Courier New" w:hAnsi="Courier New" w:cs="Courier New"/>
+          <w:iCs/>
+          <w:color w:val="auto"/>
+          <w:szCs w:val="24"/>
+        </w:rPr>
+        <w:t>Contents</w:t>
+      </w:r>
+    </w:p>
+    <w:p>
+      <w:pPr>
+        <w:pStyle w:val="ListParagraph"/>
+        <w:spacing w:after="0" w:line="360" w:lineRule="auto"/>
+        <w:jc w:val="both"/>
+        <w:rPr>
+          <w:rFonts w:ascii="Courier New" w:hAnsi="Courier New" w:cs="Courier New"/>
+          <w:iCs/>
+          <w:color w:val="auto"/>
+          <w:sz w:val="24"/>
+          <w:szCs w:val="24"/>
+        </w:rPr>
+      </w:pPr>
+      <w:r>
+        <w:rPr>
+          <w:rFonts w:ascii="Courier New" w:hAnsi="Courier New" w:cs="Courier New"/>
+          <w:iCs/>
+          <w:color w:val="auto"/>
+          <w:sz w:val="24"/>
+          <w:szCs w:val="24"/>
+        </w:rPr>
+        <w:t>•  1. Getting started and user roles</w:t>
+      </w:r>
+    </w:p>
+    <w:p>
+      <w:pPr>
+        <w:pStyle w:val="ListParagraph"/>
+        <w:spacing w:after="0" w:line="360" w:lineRule="auto"/>
+        <w:jc w:val="both"/>
+        <w:rPr>
+          <w:rFonts w:ascii="Courier New" w:hAnsi="Courier New" w:cs="Courier New"/>
+          <w:iCs/>
+          <w:color w:val="auto"/>
+          <w:sz w:val="24"/>
+          <w:szCs w:val="24"/>
+        </w:rPr>
+      </w:pPr>
+      <w:r>
+        <w:rPr>
+          <w:rFonts w:ascii="Courier New" w:hAnsi="Courier New" w:cs="Courier New"/>
+          <w:iCs/>
+          <w:color w:val="auto"/>
+          <w:sz w:val="24"/>
+          <w:szCs w:val="24"/>
+        </w:rPr>
+        <w:t>•  2. Public home page and office services</w:t>
+      </w:r>
+    </w:p>
+    <w:p>
+      <w:pPr>
+        <w:pStyle w:val="ListParagraph"/>
+        <w:spacing w:after="0" w:line="360" w:lineRule="auto"/>
+        <w:jc w:val="both"/>
+        <w:rPr>
+          <w:rFonts w:ascii="Courier New" w:hAnsi="Courier New" w:cs="Courier New"/>
+          <w:iCs/>
+          <w:color w:val="auto"/>
+          <w:sz w:val="24"/>
+          <w:szCs w:val="24"/>
+        </w:rPr>
+      </w:pPr>
+      <w:r>
+        <w:rPr>
+          <w:rFonts w:ascii="Courier New" w:hAnsi="Courier New" w:cs="Courier New"/>
+          <w:iCs/>
+          <w:color w:val="auto"/>
+          <w:sz w:val="24"/>
+          <w:szCs w:val="24"/>
+        </w:rPr>
+        <w:t>•  3. Requesting a sacramental certificate</w:t>
+      </w:r>
+    </w:p>
+    <w:p>
+      <w:pPr>
+        <w:pStyle w:val="ListParagraph"/>
+        <w:spacing w:after="0" w:line="360" w:lineRule="auto"/>
+        <w:jc w:val="both"/>
+        <w:rPr>
+          <w:rFonts w:ascii="Courier New" w:hAnsi="Courier New" w:cs="Courier New"/>
+          <w:iCs/>
+          <w:color w:val="auto"/>
+          <w:sz w:val="24"/>
+          <w:szCs w:val="24"/>
+        </w:rPr>
+      </w:pPr>
+      <w:r>
+        <w:rPr>
+          <w:rFonts w:ascii="Courier New" w:hAnsi="Courier New" w:cs="Courier New"/>
+          <w:iCs/>
+          <w:color w:val="auto"/>
+          <w:sz w:val="24"/>
+          <w:szCs w:val="24"/>
+        </w:rPr>
+        <w:t>•  4. Applying to receive a sacrament</w:t>
+      </w:r>
+    </w:p>
+    <w:p>
+      <w:pPr>
+        <w:pStyle w:val="ListParagraph"/>
+        <w:spacing w:after="0" w:line="360" w:lineRule="auto"/>
+        <w:jc w:val="both"/>
+        <w:rPr>
+          <w:rFonts w:ascii="Courier New" w:hAnsi="Courier New" w:cs="Courier New"/>
+          <w:iCs/>
+          <w:color w:val="auto"/>
+          <w:sz w:val="24"/>
+          <w:szCs w:val="24"/>
+        </w:rPr>
+      </w:pPr>
+      <w:r>
+        <w:rPr>
+          <w:rFonts w:ascii="Courier New" w:hAnsi="Courier New" w:cs="Courier New"/>
+          <w:iCs/>
+          <w:color w:val="auto"/>
+          <w:sz w:val="24"/>
+          <w:szCs w:val="24"/>
+        </w:rPr>
+        <w:t>•  5. Tracking a submission and requesting a correction</w:t>
+      </w:r>
+    </w:p>
+    <w:p>
+      <w:pPr>
+        <w:pStyle w:val="ListParagraph"/>
+        <w:spacing w:after="0" w:line="360" w:lineRule="auto"/>
+        <w:jc w:val="both"/>
+        <w:rPr>
+          <w:rFonts w:ascii="Courier New" w:hAnsi="Courier New" w:cs="Courier New"/>
+          <w:iCs/>
+          <w:color w:val="auto"/>
+          <w:sz w:val="24"/>
+          <w:szCs w:val="24"/>
+        </w:rPr>
+      </w:pPr>
+      <w:r>
+        <w:rPr>
+          <w:rFonts w:ascii="Courier New" w:hAnsi="Courier New" w:cs="Courier New"/>
+          <w:iCs/>
+          <w:color w:val="auto"/>
+          <w:sz w:val="24"/>
+          <w:szCs w:val="24"/>
+        </w:rPr>
+        <w:t>•  6. Secretary sign-in and dashboard</w:t>
+      </w:r>
+    </w:p>
+    <w:p>
+      <w:pPr>
+        <w:pStyle w:val="ListParagraph"/>
+        <w:spacing w:after="0" w:line="360" w:lineRule="auto"/>
+        <w:jc w:val="both"/>
+        <w:rPr>
+          <w:rFonts w:ascii="Courier New" w:hAnsi="Courier New" w:cs="Courier New"/>
+          <w:iCs/>
+          <w:color w:val="auto"/>
+          <w:sz w:val="24"/>
+          <w:szCs w:val="24"/>
+        </w:rPr>
+      </w:pPr>
+      <w:r>
+        <w:rPr>
+          <w:rFonts w:ascii="Courier New" w:hAnsi="Courier New" w:cs="Courier New"/>
+          <w:iCs/>
+          <w:color w:val="auto"/>
+          <w:sz w:val="24"/>
+          <w:szCs w:val="24"/>
+        </w:rPr>
+        <w:t>•  7. Reviewing certificate requests</w:t>
+      </w:r>
+    </w:p>
+    <w:p>
+      <w:pPr>
+        <w:pStyle w:val="ListParagraph"/>
+        <w:spacing w:after="0" w:line="360" w:lineRule="auto"/>
+        <w:jc w:val="both"/>
+        <w:rPr>
+          <w:rFonts w:ascii="Courier New" w:hAnsi="Courier New" w:cs="Courier New"/>
+          <w:iCs/>
+          <w:color w:val="auto"/>
+          <w:sz w:val="24"/>
+          <w:szCs w:val="24"/>
+        </w:rPr>
+      </w:pPr>
+      <w:r>
+        <w:rPr>
+          <w:rFonts w:ascii="Courier New" w:hAnsi="Courier New" w:cs="Courier New"/>
+          <w:iCs/>
+          <w:color w:val="auto"/>
+          <w:sz w:val="24"/>
+          <w:szCs w:val="24"/>
+        </w:rPr>
+        <w:t>•  Processing correction requests (Chapter 7)</w:t>
+      </w:r>
+    </w:p>
+    <w:p>
+      <w:pPr>
+        <w:pStyle w:val="ListParagraph"/>
+        <w:spacing w:after="0" w:line="360" w:lineRule="auto"/>
+        <w:jc w:val="both"/>
+        <w:rPr>
+          <w:rFonts w:ascii="Courier New" w:hAnsi="Courier New" w:cs="Courier New"/>
+          <w:iCs/>
+          <w:color w:val="auto"/>
+          <w:sz w:val="24"/>
+          <w:szCs w:val="24"/>
+        </w:rPr>
+      </w:pPr>
+      <w:r>
+        <w:rPr>
+          <w:rFonts w:ascii="Courier New" w:hAnsi="Courier New" w:cs="Courier New"/>
+          <w:iCs/>
+          <w:color w:val="auto"/>
+          <w:sz w:val="24"/>
+          <w:szCs w:val="24"/>
+        </w:rPr>
+        <w:t>•  8. Reviewing applications and managing sacramental records</w:t>
+      </w:r>
+    </w:p>
+    <w:p>
+      <w:pPr>
+        <w:pStyle w:val="ListParagraph"/>
+        <w:spacing w:after="0" w:line="360" w:lineRule="auto"/>
+        <w:jc w:val="both"/>
+        <w:rPr>
+          <w:rFonts w:ascii="Courier New" w:hAnsi="Courier New" w:cs="Courier New"/>
+          <w:iCs/>
+          <w:color w:val="auto"/>
+          <w:sz w:val="24"/>
+          <w:szCs w:val="24"/>
+          <w:lang w:val="en-US"/>
+        </w:rPr>
+      </w:pPr>
+    </w:p>
+    <w:p>
+      <w:pPr>
+        <w:pStyle w:val="ListParagraph"/>
+        <w:spacing w:after="0" w:line="360" w:lineRule="auto"/>
+        <w:jc w:val="both"/>
+        <w:rPr>
+          <w:rFonts w:ascii="Courier New" w:hAnsi="Courier New" w:cs="Courier New"/>
+          <w:iCs/>
+          <w:color w:val="auto"/>
+          <w:sz w:val="24"/>
+          <w:szCs w:val="24"/>
+          <w:lang w:val="en-US"/>
+        </w:rPr>
+      </w:pPr>
+      <w:r>
+        <w:rPr>
+          <w:rFonts w:ascii="Courier New" w:hAnsi="Courier New" w:cs="Courier New"/>
+          <w:iCs/>
+          <w:color w:val="auto"/>
+          <w:sz w:val="24"/>
+          <w:szCs w:val="24"/>
+          <w:lang w:val="en-US"/>
+        </w:rPr>
+        <w:t>•  Worked example: Baptismal record and walk-in request (Chapter 8)</w:t>
+      </w:r>
+    </w:p>
+    <w:p>
+      <w:pPr>
+        <w:pStyle w:val="ListParagraph"/>
+        <w:spacing w:after="0" w:line="360" w:lineRule="auto"/>
+        <w:jc w:val="both"/>
+        <w:rPr>
+          <w:rFonts w:ascii="Courier New" w:hAnsi="Courier New" w:cs="Courier New"/>
+          <w:iCs/>
+          <w:color w:val="auto"/>
+          <w:sz w:val="24"/>
+          <w:szCs w:val="24"/>
+          <w:lang w:val="en-US"/>
+        </w:rPr>
+      </w:pPr>
+      <w:r>
+        <w:rPr>
+          <w:rFonts w:ascii="Courier New" w:hAnsi="Courier New" w:cs="Courier New"/>
+          <w:iCs/>
+          <w:color w:val="auto"/>
+          <w:sz w:val="24"/>
+          <w:szCs w:val="24"/>
+          <w:lang w:val="en-US"/>
+        </w:rPr>
+        <w:t>•  9. Generating certificates and recording pickup</w:t>
+      </w:r>
+    </w:p>
+    <w:p>
+      <w:pPr>
+        <w:pStyle w:val="ListParagraph"/>
+        <w:spacing w:after="0" w:line="360" w:lineRule="auto"/>
+        <w:jc w:val="both"/>
+        <w:rPr>
+          <w:rFonts w:ascii="Courier New" w:hAnsi="Courier New" w:cs="Courier New"/>
+          <w:iCs/>
+          <w:color w:val="auto"/>
+          <w:sz w:val="24"/>
+          <w:szCs w:val="24"/>
+        </w:rPr>
+      </w:pPr>
+      <w:r>
+        <w:rPr>
+          <w:rFonts w:ascii="Courier New" w:hAnsi="Courier New" w:cs="Courier New"/>
+          <w:iCs/>
+          <w:color w:val="auto"/>
+          <w:sz w:val="24"/>
+          <w:szCs w:val="24"/>
+        </w:rPr>
+        <w:lastRenderedPageBreak/>
+        <w:t>•  10. Calendar, announcements, and reports</w:t>
+      </w:r>
+    </w:p>
+    <w:p>
+      <w:pPr>
+        <w:pStyle w:val="ListParagraph"/>
+        <w:spacing w:after="0" w:line="360" w:lineRule="auto"/>
+        <w:jc w:val="both"/>
+        <w:rPr>
+          <w:rFonts w:ascii="Courier New" w:hAnsi="Courier New" w:cs="Courier New"/>
+          <w:iCs/>
+          <w:color w:val="auto"/>
+          <w:sz w:val="24"/>
+          <w:szCs w:val="24"/>
+        </w:rPr>
+      </w:pPr>
+      <w:r>
+        <w:rPr>
+          <w:rFonts w:ascii="Courier New" w:hAnsi="Courier New" w:cs="Courier New"/>
+          <w:iCs/>
+          <w:color w:val="auto"/>
+          <w:sz w:val="24"/>
+          <w:szCs w:val="24"/>
+        </w:rPr>
+        <w:t>•  11. System administration and backups</w:t>
+      </w:r>
+    </w:p>
+    <w:p>
+      <w:pPr>
+        <w:pStyle w:val="ListParagraph"/>
+        <w:spacing w:after="0" w:line="360" w:lineRule="auto"/>
+        <w:jc w:val="both"/>
+        <w:rPr>
+          <w:rFonts w:ascii="Courier New" w:hAnsi="Courier New" w:cs="Courier New"/>
+          <w:iCs/>
+          <w:color w:val="auto"/>
+          <w:sz w:val="24"/>
+          <w:szCs w:val="24"/>
+        </w:rPr>
+      </w:pPr>
+      <w:r>
+        <w:rPr>
+          <w:rFonts w:ascii="Courier New" w:hAnsi="Courier New" w:cs="Courier New"/>
+          <w:iCs/>
+          <w:color w:val="auto"/>
+          <w:sz w:val="24"/>
+          <w:szCs w:val="24"/>
+        </w:rPr>
+        <w:t>•  12. Troubleshooting and quick reference</w:t>
+      </w:r>
+    </w:p>
+    <w:p>
+      <w:pPr>
+        <w:spacing w:after="0" w:line="360" w:lineRule="auto"/>
+        <w:jc w:val="both"/>
+        <w:rPr>
+          <w:rFonts w:ascii="Courier New" w:hAnsi="Courier New" w:cs="Courier New"/>
+          <w:iCs/>
+          <w:color w:val="auto"/>
+          <w:sz w:val="24"/>
+          <w:szCs w:val="24"/>
+        </w:rPr>
+      </w:pPr>
+    </w:p>
+    <w:p>
+      <w:pPr>
+        <w:pStyle w:val="Heading1"/>
+        <w:spacing w:after="0" w:line="360" w:lineRule="auto"/>
+        <w:jc w:val="both"/>
+        <w:rPr>
+          <w:rFonts w:ascii="Courier New" w:hAnsi="Courier New" w:cs="Courier New"/>
+          <w:iCs/>
+          <w:color w:val="auto"/>
+          <w:sz w:val="24"/>
+          <w:szCs w:val="24"/>
+        </w:rPr>
+      </w:pPr>
+      <w:r>
+        <w:rPr>
+          <w:rFonts w:ascii="Courier New" w:hAnsi="Courier New" w:cs="Courier New"/>
+          <w:iCs/>
+          <w:color w:val="auto"/>
+          <w:sz w:val="24"/>
+          <w:szCs w:val="24"/>
+        </w:rPr>
+        <w:t>1. Getting started and user roles</w:t>
+      </w:r>
+    </w:p>
+    <w:p>
+      <w:pPr>
+        <w:pStyle w:val="Heading2"/>
+        <w:spacing w:after="0" w:line="360" w:lineRule="auto"/>
+        <w:jc w:val="both"/>
+        <w:rPr>
+          <w:rFonts w:ascii="Courier New" w:hAnsi="Courier New" w:cs="Courier New"/>
+          <w:iCs/>
+          <w:color w:val="auto"/>
+          <w:szCs w:val="24"/>
+        </w:rPr>
+      </w:pPr>
+      <w:r>
+        <w:rPr>
+          <w:rFonts w:ascii="Courier New" w:hAnsi="Courier New" w:cs="Courier New"/>
+          <w:iCs/>
+          <w:color w:val="auto"/>
+          <w:szCs w:val="24"/>
+        </w:rPr>
+        <w:t>What the system does</w:t>
+      </w:r>
+    </w:p>
+    <w:p>
+      <w:pPr>
+        <w:spacing w:after="0" w:line="360" w:lineRule="auto"/>
+        <w:jc w:val="both"/>
+        <w:rPr>
+          <w:rFonts w:ascii="Courier New" w:hAnsi="Courier New" w:cs="Courier New"/>
+          <w:iCs/>
+          <w:color w:val="auto"/>
+          <w:sz w:val="24"/>
+          <w:szCs w:val="24"/>
+        </w:rPr>
+      </w:pPr>
+      <w:r>
+        <w:rPr>
+          <w:rFonts w:ascii="Courier New" w:hAnsi="Courier New" w:cs="Courier New"/>
+          <w:iCs/>
+          <w:color w:val="auto"/>
+          <w:sz w:val="24"/>
+          <w:szCs w:val="24"/>
+        </w:rPr>
+        <w:t>SRS-SPPO supports parish service intake, sacramental-record keeping, certificate processing, scheduling, and office reporting. Public visitors can submit information without creating an account. Authorized staff sign in to review and process work.</w:t>
+      </w:r>
+    </w:p>
+    <w:p>
+      <w:pPr>
+        <w:pStyle w:val="Heading2"/>
+        <w:spacing w:after="0" w:line="360" w:lineRule="auto"/>
+        <w:jc w:val="both"/>
+        <w:rPr>
+          <w:rFonts w:ascii="Courier New" w:hAnsi="Courier New" w:cs="Courier New"/>
+          <w:iCs/>
+          <w:color w:val="auto"/>
+          <w:szCs w:val="24"/>
+        </w:rPr>
+      </w:pPr>
+      <w:r>
+        <w:rPr>
+          <w:rFonts w:ascii="Courier New" w:hAnsi="Courier New" w:cs="Courier New"/>
+          <w:iCs/>
+          <w:color w:val="auto"/>
+          <w:szCs w:val="24"/>
+        </w:rPr>
+        <w:t>Access points</w:t>
+      </w:r>
+    </w:p>
+    <w:p>
+      <w:pPr>
+        <w:pStyle w:val="ListParagraph"/>
+        <w:spacing w:after="0" w:line="360" w:lineRule="auto"/>
+        <w:jc w:val="both"/>
+        <w:rPr>
+          <w:rFonts w:ascii="Courier New" w:hAnsi="Courier New" w:cs="Courier New"/>
+          <w:iCs/>
+          <w:color w:val="auto"/>
+          <w:sz w:val="24"/>
+          <w:szCs w:val="24"/>
+        </w:rPr>
+      </w:pPr>
+      <w:r>
+        <w:rPr>
+          <w:rFonts w:ascii="Courier New" w:hAnsi="Courier New" w:cs="Courier New"/>
+          <w:iCs/>
+          <w:color w:val="auto"/>
+          <w:sz w:val="24"/>
+          <w:szCs w:val="24"/>
+        </w:rPr>
+        <w:t>•  Public website: use the official parish link provided by the Parish Office. The home page includes service links, requirements, a calendar, and request tracking.</w:t>
+      </w:r>
+    </w:p>
+    <w:p>
+      <w:pPr>
+        <w:pStyle w:val="ListParagraph"/>
+        <w:spacing w:after="0" w:line="360" w:lineRule="auto"/>
+        <w:jc w:val="both"/>
+        <w:rPr>
+          <w:rFonts w:ascii="Courier New" w:hAnsi="Courier New" w:cs="Courier New"/>
+          <w:iCs/>
+          <w:color w:val="auto"/>
+          <w:sz w:val="24"/>
+          <w:szCs w:val="24"/>
+        </w:rPr>
+      </w:pPr>
+      <w:r>
+        <w:rPr>
+          <w:rFonts w:ascii="Courier New" w:hAnsi="Courier New" w:cs="Courier New"/>
+          <w:iCs/>
+          <w:color w:val="auto"/>
+          <w:sz w:val="24"/>
+          <w:szCs w:val="24"/>
+        </w:rPr>
+        <w:t>•  Staff area: open the staff login link supplied by the Parish Office. Staff pages require an active account.</w:t>
+      </w:r>
+    </w:p>
+    <w:p>
+      <w:pPr>
+        <w:pStyle w:val="ListParagraph"/>
+        <w:spacing w:after="0" w:line="360" w:lineRule="auto"/>
+        <w:jc w:val="both"/>
+        <w:rPr>
+          <w:rFonts w:ascii="Courier New" w:hAnsi="Courier New" w:cs="Courier New"/>
+          <w:iCs/>
+          <w:color w:val="auto"/>
+          <w:sz w:val="24"/>
+          <w:szCs w:val="24"/>
+        </w:rPr>
+      </w:pPr>
+      <w:r>
+        <w:rPr>
+          <w:rFonts w:ascii="Courier New" w:hAnsi="Courier New" w:cs="Courier New"/>
+          <w:iCs/>
+          <w:color w:val="auto"/>
+          <w:sz w:val="24"/>
+          <w:szCs w:val="24"/>
+        </w:rPr>
+        <w:t>•  A local development URL such as http://localhost/srs-sppo is for the local test installation only; it is not the public hosted address.</w:t>
+      </w:r>
+    </w:p>
+    <w:p>
+      <w:pPr>
+        <w:pStyle w:val="Heading2"/>
+        <w:spacing w:after="0" w:line="360" w:lineRule="auto"/>
+        <w:jc w:val="both"/>
+        <w:rPr>
+          <w:rFonts w:ascii="Courier New" w:hAnsi="Courier New" w:cs="Courier New"/>
+          <w:iCs/>
+          <w:color w:val="auto"/>
+          <w:szCs w:val="24"/>
+        </w:rPr>
+      </w:pPr>
+      <w:r>
+        <w:rPr>
+          <w:rFonts w:ascii="Courier New" w:hAnsi="Courier New" w:cs="Courier New"/>
+          <w:iCs/>
+          <w:color w:val="auto"/>
+          <w:szCs w:val="24"/>
+        </w:rPr>
+        <w:lastRenderedPageBreak/>
+        <w:t>Roles and responsibilities</w:t>
+      </w:r>
+    </w:p>
+    <w:p>
+      <w:pPr>
+        <w:pStyle w:val="ListParagraph"/>
+        <w:spacing w:after="0" w:line="360" w:lineRule="auto"/>
+        <w:jc w:val="both"/>
+        <w:rPr>
+          <w:rFonts w:ascii="Courier New" w:hAnsi="Courier New" w:cs="Courier New"/>
+          <w:iCs/>
+          <w:color w:val="auto"/>
+          <w:sz w:val="24"/>
+          <w:szCs w:val="24"/>
+        </w:rPr>
+      </w:pPr>
+      <w:r>
+        <w:rPr>
+          <w:rFonts w:ascii="Courier New" w:hAnsi="Courier New" w:cs="Courier New"/>
+          <w:iCs/>
+          <w:color w:val="auto"/>
+          <w:sz w:val="24"/>
+          <w:szCs w:val="24"/>
+        </w:rPr>
+        <w:t>•  Public visitor: supplies accurate information, keeps the tracking number, and follows office directions.</w:t>
+      </w:r>
+    </w:p>
+    <w:p>
+      <w:pPr>
+        <w:pStyle w:val="ListParagraph"/>
+        <w:spacing w:after="0" w:line="360" w:lineRule="auto"/>
+        <w:jc w:val="both"/>
+        <w:rPr>
+          <w:rFonts w:ascii="Courier New" w:hAnsi="Courier New" w:cs="Courier New"/>
+          <w:iCs/>
+          <w:color w:val="auto"/>
+          <w:sz w:val="24"/>
+          <w:szCs w:val="24"/>
+        </w:rPr>
+      </w:pPr>
+      <w:r>
+        <w:rPr>
+          <w:rFonts w:ascii="Courier New" w:hAnsi="Courier New" w:cs="Courier New"/>
+          <w:iCs/>
+          <w:color w:val="auto"/>
+          <w:sz w:val="24"/>
+          <w:szCs w:val="24"/>
+        </w:rPr>
+        <w:t>•  Parish Secretary: reviews submissions, verifies information, updates workflow status, maintains records, schedules events, and prepares reports.</w:t>
+      </w:r>
+    </w:p>
+    <w:p>
+      <w:pPr>
+        <w:pStyle w:val="ListParagraph"/>
+        <w:spacing w:after="0" w:line="360" w:lineRule="auto"/>
+        <w:jc w:val="both"/>
+        <w:rPr>
+          <w:rFonts w:ascii="Courier New" w:hAnsi="Courier New" w:cs="Courier New"/>
+          <w:iCs/>
+          <w:color w:val="auto"/>
+          <w:sz w:val="24"/>
+          <w:szCs w:val="24"/>
+        </w:rPr>
+      </w:pPr>
+      <w:r>
+        <w:rPr>
+          <w:rFonts w:ascii="Courier New" w:hAnsi="Courier New" w:cs="Courier New"/>
+          <w:iCs/>
+          <w:color w:val="auto"/>
+          <w:sz w:val="24"/>
+          <w:szCs w:val="24"/>
+        </w:rPr>
+        <w:t>•  System maintainer: uses the same Secretary staff account for in-app maintenance, protects staff access, applies approved database updates, and creates protected backups. The designated technical administrator handles hosting, recovery, and database restoration.</w:t>
+      </w:r>
+    </w:p>
+    <w:p>
+      <w:pPr>
+        <w:spacing w:after="0" w:line="360" w:lineRule="auto"/>
+        <w:jc w:val="both"/>
+        <w:rPr>
+          <w:rFonts w:ascii="Courier New" w:hAnsi="Courier New" w:cs="Courier New"/>
+          <w:iCs/>
+          <w:color w:val="auto"/>
+          <w:sz w:val="24"/>
+          <w:szCs w:val="24"/>
+        </w:rPr>
+      </w:pPr>
+    </w:p>
+    <w:p>
+      <w:pPr>
+        <w:spacing w:after="0" w:line="360" w:lineRule="auto"/>
+        <w:ind w:firstLine="120"/>
+        <w:jc w:val="both"/>
+        <w:rPr>
+          <w:rFonts w:ascii="Courier New" w:hAnsi="Courier New" w:cs="Courier New"/>
+          <w:iCs/>
+          <w:color w:val="auto"/>
+          <w:sz w:val="24"/>
+          <w:szCs w:val="24"/>
+        </w:rPr>
+      </w:pPr>
+      <w:r>
+        <w:rPr>
+          <w:rFonts w:ascii="Courier New" w:hAnsi="Courier New" w:cs="Courier New"/>
+          <w:b/>
+          <w:bCs/>
+          <w:iCs/>
+          <w:color w:val="auto"/>
           <w:sz w:val="24"/>
           <w:szCs w:val="24"/>
         </w:rPr>
@@ -1010,54 +992,54 @@
           <w:sz w:val="24"/>
           <w:szCs w:val="24"/>
         </w:rPr>
+        <w:t>2. Public home page and office services</w:t>
+      </w:r>
+    </w:p>
+    <w:p>
+      <w:pPr>
+        <w:spacing w:after="0" w:line="360" w:lineRule="auto"/>
+        <w:jc w:val="both"/>
+        <w:rPr>
+          <w:rFonts w:ascii="Courier New" w:hAnsi="Courier New" w:cs="Courier New"/>
+          <w:iCs/>
+          <w:color w:val="auto"/>
+          <w:sz w:val="24"/>
+          <w:szCs w:val="24"/>
+        </w:rPr>
+      </w:pPr>
+      <w:r>
+        <w:rPr>
+          <w:rFonts w:ascii="Courier New" w:hAnsi="Courier New" w:cs="Courier New"/>
+          <w:iCs/>
+          <w:color w:val="auto"/>
+          <w:sz w:val="24"/>
+          <w:szCs w:val="24"/>
+        </w:rPr>
+        <w:t>The public home page is the starting point. Use the navigation menu or the large service buttons to find the correct task.</w:t>
+      </w:r>
+    </w:p>
+    <w:p>
+      <w:pPr>
+        <w:spacing w:after="0" w:line="360" w:lineRule="auto"/>
+        <w:jc w:val="both"/>
+        <w:rPr>
+          <w:rFonts w:ascii="Courier New" w:hAnsi="Courier New" w:cs="Courier New"/>
+          <w:iCs/>
+          <w:color w:val="auto"/>
+          <w:sz w:val="24"/>
+          <w:szCs w:val="24"/>
+        </w:rPr>
+      </w:pPr>
+      <w:r>
+        <w:rPr>
+          <w:rFonts w:ascii="Courier New" w:hAnsi="Courier New" w:cs="Courier New"/>
+          <w:iCs/>
+          <w:noProof/>
+          <w:color w:val="auto"/>
+          <w:sz w:val="24"/>
+          <w:szCs w:val="24"/>
+        </w:rPr>
         <w:lastRenderedPageBreak/>
-        <w:t>2. Public home page and office services</w:t>
-      </w:r>
-    </w:p>
-    <w:p>
-      <w:pPr>
-        <w:spacing w:after="0" w:line="360" w:lineRule="auto"/>
-        <w:jc w:val="both"/>
-        <w:rPr>
-          <w:rFonts w:ascii="Courier New" w:hAnsi="Courier New" w:cs="Courier New"/>
-          <w:iCs/>
-          <w:color w:val="auto"/>
-          <w:sz w:val="24"/>
-          <w:szCs w:val="24"/>
-        </w:rPr>
-      </w:pPr>
-      <w:r>
-        <w:rPr>
-          <w:rFonts w:ascii="Courier New" w:hAnsi="Courier New" w:cs="Courier New"/>
-          <w:iCs/>
-          <w:color w:val="auto"/>
-          <w:sz w:val="24"/>
-          <w:szCs w:val="24"/>
-        </w:rPr>
-        <w:t>The public home page is the starting point. Use the navigation menu or the large service buttons to find the correct task.</w:t>
-      </w:r>
-    </w:p>
-    <w:p>
-      <w:pPr>
-        <w:spacing w:after="0" w:line="360" w:lineRule="auto"/>
-        <w:jc w:val="both"/>
-        <w:rPr>
-          <w:rFonts w:ascii="Courier New" w:hAnsi="Courier New" w:cs="Courier New"/>
-          <w:iCs/>
-          <w:color w:val="auto"/>
-          <w:sz w:val="24"/>
-          <w:szCs w:val="24"/>
-        </w:rPr>
-      </w:pPr>
-      <w:r>
-        <w:rPr>
-          <w:rFonts w:ascii="Courier New" w:hAnsi="Courier New" w:cs="Courier New"/>
-          <w:iCs/>
-          <w:noProof/>
-          <w:color w:val="auto"/>
-          <w:sz w:val="24"/>
-          <w:szCs w:val="24"/>
-        </w:rPr>
         <w:drawing>
           <wp:inline distT="0" distB="0" distL="0" distR="0" wp14:anchorId="69600273" wp14:editId="7E9D8159">
             <wp:extent cx="4002175" cy="2636865"/>
@@ -1214,65 +1196,55 @@
           <w:sz w:val="24"/>
           <w:szCs w:val="24"/>
         </w:rPr>
-        <w:t xml:space="preserve">•  Track a request or application after submission using its tracking number and </w:t>
-      </w:r>
-      <w:r>
-        <w:rPr>
-          <w:rFonts w:ascii="Courier New" w:hAnsi="Courier New" w:cs="Courier New"/>
-          <w:iCs/>
+        <w:t>•  Track a request or application after submission using its tracking number and the same email address entered on the form.</w:t>
+      </w:r>
+    </w:p>
+    <w:p>
+      <w:pPr>
+        <w:pStyle w:val="ListParagraph"/>
+        <w:spacing w:after="0" w:line="360" w:lineRule="auto"/>
+        <w:jc w:val="both"/>
+        <w:rPr>
+          <w:rFonts w:ascii="Courier New" w:hAnsi="Courier New" w:cs="Courier New"/>
+          <w:iCs/>
+          <w:color w:val="auto"/>
+          <w:sz w:val="24"/>
+          <w:szCs w:val="24"/>
+        </w:rPr>
+      </w:pPr>
+      <w:r>
+        <w:rPr>
+          <w:rFonts w:ascii="Courier New" w:hAnsi="Courier New" w:cs="Courier New"/>
+          <w:iCs/>
+          <w:color w:val="auto"/>
+          <w:sz w:val="24"/>
+          <w:szCs w:val="24"/>
+        </w:rPr>
+        <w:t>•  Request a correction if a certificate has already been issued and you need to report an error.</w:t>
+      </w:r>
+    </w:p>
+    <w:p>
+      <w:pPr>
+        <w:spacing w:after="0" w:line="360" w:lineRule="auto"/>
+        <w:jc w:val="both"/>
+        <w:rPr>
+          <w:rFonts w:ascii="Courier New" w:hAnsi="Courier New" w:cs="Courier New"/>
+          <w:iCs/>
+          <w:color w:val="auto"/>
+          <w:sz w:val="24"/>
+          <w:szCs w:val="24"/>
+        </w:rPr>
+      </w:pPr>
+      <w:r>
+        <w:rPr>
+          <w:rFonts w:ascii="Courier New" w:hAnsi="Courier New" w:cs="Courier New"/>
+          <w:iCs/>
+          <w:noProof/>
           <w:color w:val="auto"/>
           <w:sz w:val="24"/>
           <w:szCs w:val="24"/>
         </w:rPr>
         <w:lastRenderedPageBreak/>
-        <w:t>the same email address entered on the form.</w:t>
-      </w:r>
-    </w:p>
-    <w:p>
-      <w:pPr>
-        <w:pStyle w:val="ListParagraph"/>
-        <w:spacing w:after="0" w:line="360" w:lineRule="auto"/>
-        <w:jc w:val="both"/>
-        <w:rPr>
-          <w:rFonts w:ascii="Courier New" w:hAnsi="Courier New" w:cs="Courier New"/>
-          <w:iCs/>
-          <w:color w:val="auto"/>
-          <w:sz w:val="24"/>
-          <w:szCs w:val="24"/>
-        </w:rPr>
-      </w:pPr>
-      <w:r>
-        <w:rPr>
-          <w:rFonts w:ascii="Courier New" w:hAnsi="Courier New" w:cs="Courier New"/>
-          <w:iCs/>
-          <w:color w:val="auto"/>
-          <w:sz w:val="24"/>
-          <w:szCs w:val="24"/>
-        </w:rPr>
-        <w:t>•  Request a correction if a certificate has already been issued and you need to report an error.</w:t>
-      </w:r>
-    </w:p>
-    <w:p>
-      <w:pPr>
-        <w:spacing w:after="0" w:line="360" w:lineRule="auto"/>
-        <w:jc w:val="both"/>
-        <w:rPr>
-          <w:rFonts w:ascii="Courier New" w:hAnsi="Courier New" w:cs="Courier New"/>
-          <w:iCs/>
-          <w:color w:val="auto"/>
-          <w:sz w:val="24"/>
-          <w:szCs w:val="24"/>
-        </w:rPr>
-      </w:pPr>
-      <w:r>
-        <w:rPr>
-          <w:rFonts w:ascii="Courier New" w:hAnsi="Courier New" w:cs="Courier New"/>
-          <w:iCs/>
-          <w:noProof/>
-          <w:color w:val="auto"/>
-          <w:sz w:val="24"/>
-          <w:szCs w:val="24"/>
-        </w:rPr>
         <w:drawing>
           <wp:inline distT="0" distB="0" distL="0" distR="0" wp14:anchorId="0D6114A5" wp14:editId="11CA5DCF">
             <wp:extent cx="4083198" cy="3287860"/>
@@ -1429,31 +1401,31 @@
           <w:sz w:val="24"/>
           <w:szCs w:val="24"/>
         </w:rPr>
+        <w:t>•  A submission is not approval. The secretary verifies the information and confirms next steps.</w:t>
+      </w:r>
+    </w:p>
+    <w:p>
+      <w:pPr>
+        <w:pStyle w:val="ListParagraph"/>
+        <w:spacing w:after="0" w:line="360" w:lineRule="auto"/>
+        <w:jc w:val="both"/>
+        <w:rPr>
+          <w:rFonts w:ascii="Courier New" w:hAnsi="Courier New" w:cs="Courier New"/>
+          <w:iCs/>
+          <w:color w:val="auto"/>
+          <w:sz w:val="24"/>
+          <w:szCs w:val="24"/>
+        </w:rPr>
+      </w:pPr>
+      <w:r>
+        <w:rPr>
+          <w:rFonts w:ascii="Courier New" w:hAnsi="Courier New" w:cs="Courier New"/>
+          <w:iCs/>
+          <w:color w:val="auto"/>
+          <w:sz w:val="24"/>
+          <w:szCs w:val="24"/>
+        </w:rPr>
         <w:lastRenderedPageBreak/>
-        <w:t>•  A submission is not approval. The secretary verifies the information and confirms next steps.</w:t>
-      </w:r>
-    </w:p>
-    <w:p>
-      <w:pPr>
-        <w:pStyle w:val="ListParagraph"/>
-        <w:spacing w:after="0" w:line="360" w:lineRule="auto"/>
-        <w:jc w:val="both"/>
-        <w:rPr>
-          <w:rFonts w:ascii="Courier New" w:hAnsi="Courier New" w:cs="Courier New"/>
-          <w:iCs/>
-          <w:color w:val="auto"/>
-          <w:sz w:val="24"/>
-          <w:szCs w:val="24"/>
-        </w:rPr>
-      </w:pPr>
-      <w:r>
-        <w:rPr>
-          <w:rFonts w:ascii="Courier New" w:hAnsi="Courier New" w:cs="Courier New"/>
-          <w:iCs/>
-          <w:color w:val="auto"/>
-          <w:sz w:val="24"/>
-          <w:szCs w:val="24"/>
-        </w:rPr>
         <w:t>•  Certificates are collected from the Parish Office; they are not downloaded from the website.</w:t>
       </w:r>
     </w:p>
@@ -1632,8 +1604,18 @@
           <w:sz w:val="24"/>
           <w:szCs w:val="24"/>
         </w:rPr>
+        <w:t xml:space="preserve">4.  For Baptism, Confirmation, and First Communion searches, enter one or both parent names when known. For marriage, </w:t>
+      </w:r>
+      <w:r>
+        <w:rPr>
+          <w:rFonts w:ascii="Courier New" w:hAnsi="Courier New" w:cs="Courier New"/>
+          <w:iCs/>
+          <w:color w:val="auto"/>
+          <w:sz w:val="24"/>
+          <w:szCs w:val="24"/>
+        </w:rPr>
         <w:lastRenderedPageBreak/>
-        <w:t>4.  For Baptism, Confirmation, and First Communion searches, enter one or both parent names when known. For marriage, provide both spouses' identifying details as requested.</w:t>
+        <w:t>provide both spouses' identifying details as requested.</w:t>
       </w:r>
     </w:p>
     <w:p>
@@ -3077,6 +3059,7 @@
         <w:rPr>
           <w:rFonts w:ascii="Courier New" w:hAnsi="Courier New" w:cs="Courier New"/>
           <w:iCs/>
+          <w:noProof/>
           <w:color w:val="auto"/>
           <w:sz w:val="24"/>
           <w:szCs w:val="24"/>
@@ -3627,6 +3610,7 @@
           <w:rFonts w:ascii="Courier New" w:hAnsi="Courier New" w:cs="Courier New"/>
           <w:i w:val="0"/>
           <w:iCs/>
+          <w:noProof/>
           <w:color w:val="auto"/>
           <w:sz w:val="24"/>
           <w:szCs w:val="24"/>
@@ -4986,6 +4970,7 @@
         <w:rPr>
           <w:rFonts w:ascii="Courier New" w:hAnsi="Courier New" w:cs="Courier New"/>
           <w:iCs/>
+          <w:noProof/>
           <w:color w:val="auto"/>
           <w:sz w:val="24"/>
           <w:szCs w:val="24"/>
@@ -5654,6 +5639,7 @@
         <w:rPr>
           <w:rFonts w:ascii="Courier New" w:hAnsi="Courier New" w:cs="Courier New"/>
           <w:iCs/>
+          <w:noProof/>
           <w:color w:val="auto"/>
           <w:sz w:val="24"/>
           <w:szCs w:val="24"/>
@@ -5976,6 +5962,7 @@
           <w:rFonts w:ascii="Courier New" w:hAnsi="Courier New" w:cs="Courier New"/>
           <w:i w:val="0"/>
           <w:iCs/>
+          <w:noProof/>
           <w:color w:val="auto"/>
           <w:sz w:val="24"/>
           <w:szCs w:val="24"/>
@@ -6116,6 +6103,7 @@
         <w:rPr>
           <w:rFonts w:ascii="Courier New" w:hAnsi="Courier New" w:cs="Courier New"/>
           <w:iCs/>
+          <w:noProof/>
           <w:color w:val="auto"/>
           <w:sz w:val="24"/>
           <w:szCs w:val="24"/>
@@ -6348,6 +6336,7 @@
         <w:rPr>
           <w:rFonts w:ascii="Courier New" w:hAnsi="Courier New" w:cs="Courier New"/>
           <w:iCs/>
+          <w:noProof/>
           <w:color w:val="auto"/>
           <w:sz w:val="24"/>
           <w:szCs w:val="24"/>
@@ -6533,6 +6522,7 @@
         <w:rPr>
           <w:rFonts w:ascii="Courier New" w:hAnsi="Courier New" w:cs="Courier New"/>
           <w:iCs/>
+          <w:noProof/>
           <w:color w:val="auto"/>
           <w:sz w:val="24"/>
           <w:szCs w:val="24"/>

</xml_diff>